<commit_message>
Prepare shareable email agent package
</commit_message>
<xml_diff>
--- a/AI_Email_Agent_Failure_Register.docx
+++ b/AI_Email_Agent_Failure_Register.docx
@@ -30,20 +30,20 @@
         <w:keepLines/>
       </w:pPr>
       <w:r>
-        <w:t>Prepared for Bhagyaraj by Codex   |   Updated 21 September 2026</w:t>
-      </w:r>
-    </w:p>
-    <w:p>
-      <w:pPr>
-        <w:spacing w:after="120" w:line="276" w:lineRule="auto"/>
-        <w:jc w:val="both"/>
-        <w:rPr>
-          <w:rFonts w:ascii="Helvetica Neue" w:eastAsia="Helvetica Neue" w:hAnsi="Helvetica Neue" w:cs="Helvetica Neue"/>
-        </w:rPr>
-        <w:keepLines/>
-      </w:pPr>
-      <w:r>
-        <w:t>This register records 24 findings from the dashboard audit and the repair work on 18 September 2026, with a current file and test review refreshed on 21 September 2026. It preserves symptoms, corrections and verification evidence for future maintenance. The updated app is configured for Outlook and Google Gemini, PIN protection is enabled, automatic sending remains off, and the limits below remain explicit.</w:t>
+        <w:t>Prepared for Bhagyaraj by Codex   |   Updated 22 September 2026</w:t>
+      </w:r>
+    </w:p>
+    <w:p>
+      <w:pPr>
+        <w:spacing w:after="120" w:line="276" w:lineRule="auto"/>
+        <w:jc w:val="both"/>
+        <w:rPr>
+          <w:rFonts w:ascii="Helvetica Neue" w:eastAsia="Helvetica Neue" w:hAnsi="Helvetica Neue" w:cs="Helvetica Neue"/>
+        </w:rPr>
+        <w:keepLines/>
+      </w:pPr>
+      <w:r>
+        <w:t>This register records 24 findings from the dashboard audit and the repair work on 18 September 2026, with a current file and test review refreshed on 22 September 2026. It preserves symptoms, corrections and verification evidence for future maintenance. The updated app is configured for Outlook and OpenRouter using google/gemini-2.5-flash, PIN protection is enabled, automatic sending remains off, Classic Outlook reply signatures are supported, and the limits below remain explicit.</w:t>
       </w:r>
     </w:p>
     <w:p>
@@ -65,7 +65,7 @@
         <w:keepLines/>
       </w:pPr>
       <w:r>
-        <w:t>Current automated verification: On 21 September 2026, .venv\Scripts\python.exe -m unittest discover -s tests -v ran 22 tests successfully. JavaScript and dashboard checks should be rerun when frontend behavior changes. Provider sends, deletes and AI rewrites in tests use mocks and temporary data.</w:t>
+        <w:t>Current automated verification: On 22 September 2026, .venv\Scripts\python.exe -m unittest discover -s tests -v ran 32 tests successfully. JavaScript syntax checks passed for dashboard review and app scripts. Provider sends, deletes, signature uploads and AI rewrites in tests use mocks and temporary data.</w:t>
       </w:r>
     </w:p>
     <w:p>
@@ -91,7 +91,7 @@
         <w:keepLines/>
       </w:pPr>
       <w:r>
-        <w:t>Current configuration review: config.yaml currently enables Outlook, selects Google Gemini with gemini-3.6-flash, enables PIN security, enables sound and snooze behavior, keeps automatic sending disabled, and listens on 127.0.0.1:5001.</w:t>
+        <w:t>Current configuration review: config.yaml currently enables Outlook, selects OpenRouter with google/gemini-2.5-flash, enables PIN security, enables sound and snooze behavior, keeps automatic sending disabled, and listens on 127.0.0.1:5001.</w:t>
       </w:r>
     </w:p>
     <w:p>
@@ -1344,6 +1344,28 @@
         <w:keepLines/>
       </w:pPr>
       <w:r>
+        <w:t>Current signature support</w:t>
+      </w:r>
+    </w:p>
+    <w:p>
+      <w:pPr>
+        <w:spacing w:after="120" w:line="276" w:lineRule="auto"/>
+        <w:jc w:val="both"/>
+        <w:rPr>
+          <w:rFonts w:ascii="Helvetica Neue" w:eastAsia="Helvetica Neue" w:hAnsi="Helvetica Neue" w:cs="Helvetica Neue"/>
+        </w:rPr>
+        <w:keepLines/>
+      </w:pPr>
+      <w:r>
+        <w:t>The app now detects a matching Classic Outlook reply signature for the connected mailbox, appends it to Outlook draft HTML, attaches inline signature images by content ID, and shows signature status in the review UI. Tests cover account matching, image rewriting, escaped reply composition and duplicate inline-image prevention.</w:t>
+      </w:r>
+    </w:p>
+    <w:p>
+      <w:pPr>
+        <w:pStyle w:val="Heading2"/>
+        <w:keepLines/>
+      </w:pPr>
+      <w:r>
         <w:t>Live verification still required</w:t>
       </w:r>
     </w:p>
@@ -1357,7 +1379,7 @@
         <w:keepLines/>
       </w:pPr>
       <w:r>
-        <w:t>Outlook mailbox polling, provider draft synchronization against a real mailbox, native file chooser behavior and audible chimes still need live-account verification after sign-in. Passing tests verify the exercised behavior, not every possible provider or message.</w:t>
+        <w:t>Outlook mailbox polling, provider draft synchronization against a real mailbox, real Classic Outlook signature discovery, native file chooser behavior and audible chimes still need live-account verification after sign-in. Passing tests verify the exercised behavior, not every possible provider or message.</w:t>
       </w:r>
     </w:p>
     <w:p>
@@ -1472,24 +1494,15 @@
     </w:p>
     <w:p>
       <w:pPr>
-        <w:pStyle w:val="Heading2"/>
-        <w:keepLines/>
-      </w:pPr>
-      <w:r>
-        <w:t>Technical sources</w:t>
-      </w:r>
-    </w:p>
-    <w:p>
-      <w:pPr>
-        <w:spacing w:after="120" w:line="276" w:lineRule="auto"/>
-        <w:jc w:val="both"/>
-        <w:rPr>
-          <w:rFonts w:ascii="Helvetica Neue" w:eastAsia="Helvetica Neue" w:hAnsi="Helvetica Neue" w:cs="Helvetica Neue"/>
-        </w:rPr>
-        <w:keepLines/>
-      </w:pPr>
-      <w:r>
-        <w:t>Gemini REST request format: https://ai.google.dev/api/generate-content. Model availability was established from the authenticated provider response and successful synthetic generation on the verification date.</w:t>
+        <w:spacing w:after="120" w:line="276" w:lineRule="auto"/>
+        <w:jc w:val="both"/>
+        <w:rPr>
+          <w:rFonts w:ascii="Helvetica Neue" w:eastAsia="Helvetica Neue" w:hAnsi="Helvetica Neue" w:cs="Helvetica Neue"/>
+        </w:rPr>
+        <w:keepLines/>
+      </w:pPr>
+      <w:r>
+        <w:t>Technical sources: OpenRouter request routing uses its OpenAI-compatible chat completions endpoint with the configured provider/model slug. Direct Gemini request handling remains available as a fallback provider path.</w:t>
       </w:r>
     </w:p>
     <w:sectPr>

</xml_diff>